<commit_message>
docs: regenerate study guide with updated graph stats and drugTreatsPhenotype
</commit_message>
<xml_diff>
--- a/docs/CardioKB_Complete_Study_Guide.docx
+++ b/docs/CardioKB_Complete_Study_Guide.docx
@@ -365,7 +365,7 @@
         <w:ind w:left="720"/>
       </w:pPr>
       <w:r>
-        <w:t>5,443,134 relationships across 27 relationship types</w:t>
+        <w:t>5,456,579 relationships across 28 relationship types</w:t>
       </w:r>
     </w:p>
     <w:p>
@@ -1389,7 +1389,7 @@
     </w:p>
     <w:p>
       <w:r>
-        <w:t>The current CardioKB graph (as of July 2026) contains 459,092 nodes across 17 distinct node types and 5,443,134 relationships across 27 relationship types. There are 22 data sources providing edges (each tagged with a source property), plus 3 ML prediction sources. Every single relationship in the graph carries a source property identifying which database or model produced it.</w:t>
+        <w:t>The current CardioKB graph (as of July 2026) contains 459,092 nodes across 17 distinct node types and 5,456,579 relationships across 28 relationship types. There are 22 data sources providing edges (each tagged with a source property), plus 3 ML prediction sources and 1 text-mined source (DrugBank_Indications). Every single relationship in the graph carries a source property identifying which database or model produced it.</w:t>
       </w:r>
     </w:p>
     <w:p>
@@ -4190,6 +4190,86 @@
               <w:rPr>
                 <w:sz w:val="18"/>
               </w:rPr>
+              <w:t>drugTreatsPhenotype</w:t>
+            </w:r>
+          </w:p>
+        </w:tc>
+        <w:tc>
+          <w:tcPr>
+            <w:tcW w:type="dxa" w:w="1134"/>
+          </w:tcPr>
+          <w:p>
+            <w:r>
+              <w:rPr>
+                <w:sz w:val="18"/>
+              </w:rPr>
+              <w:t>Drug→Phenotype</w:t>
+            </w:r>
+          </w:p>
+        </w:tc>
+        <w:tc>
+          <w:tcPr>
+            <w:tcW w:type="dxa" w:w="1020"/>
+          </w:tcPr>
+          <w:p>
+            <w:r>
+              <w:rPr>
+                <w:sz w:val="18"/>
+              </w:rPr>
+              <w:t>DrugBank_Indications</w:t>
+            </w:r>
+          </w:p>
+        </w:tc>
+        <w:tc>
+          <w:tcPr>
+            <w:tcW w:type="dxa" w:w="737"/>
+          </w:tcPr>
+          <w:p>
+            <w:r>
+              <w:rPr>
+                <w:sz w:val="18"/>
+              </w:rPr>
+              <w:t>10,955</w:t>
+            </w:r>
+          </w:p>
+        </w:tc>
+        <w:tc>
+          <w:tcPr>
+            <w:tcW w:type="dxa" w:w="1020"/>
+          </w:tcPr>
+          <w:p>
+            <w:r>
+              <w:rPr>
+                <w:sz w:val="18"/>
+              </w:rPr>
+              <w:t>—</w:t>
+            </w:r>
+          </w:p>
+        </w:tc>
+        <w:tc>
+          <w:tcPr>
+            <w:tcW w:type="dxa" w:w="3118"/>
+          </w:tcPr>
+          <w:p>
+            <w:r>
+              <w:rPr>
+                <w:sz w:val="18"/>
+              </w:rPr>
+              <w:t>This drug treats this phenotype/condition (text-mined from DrugBank indication fields)</w:t>
+            </w:r>
+          </w:p>
+        </w:tc>
+      </w:tr>
+      <w:tr>
+        <w:tc>
+          <w:tcPr>
+            <w:tcW w:type="dxa" w:w="1701"/>
+          </w:tcPr>
+          <w:p>
+            <w:r>
+              <w:rPr>
+                <w:sz w:val="18"/>
+              </w:rPr>
               <w:t>drugTreatsDisease</w:t>
             </w:r>
           </w:p>
@@ -4216,7 +4296,7 @@
               <w:rPr>
                 <w:sz w:val="18"/>
               </w:rPr>
-              <w:t>CTD+CT+DC</w:t>
+              <w:t>CTD+CT+DC+DBI</w:t>
             </w:r>
           </w:p>
         </w:tc>
@@ -4229,7 +4309,7 @@
               <w:rPr>
                 <w:sz w:val="18"/>
               </w:rPr>
-              <w:t>3,782</w:t>
+              <w:t>6,272</w:t>
             </w:r>
           </w:p>
         </w:tc>
@@ -4255,7 +4335,7 @@
               <w:rPr>
                 <w:sz w:val="18"/>
               </w:rPr>
-              <w:t>This drug is used to treat this disease (curated + clinical trial + FDA evidence)</w:t>
+              <w:t>This drug is used to treat this disease (curated + clinical trial + FDA + text-mined evidence)</w:t>
             </w:r>
           </w:p>
         </w:tc>
@@ -5384,7 +5464,7 @@
     </w:p>
     <w:p>
       <w:r>
-        <w:t>The drugTreatsDisease relationship is the most important edge type for the ML drug repurposing pipeline. It comes from three complementary sources, each providing a different type of evidence:</w:t>
+        <w:t>The drugTreatsDisease relationship is the most important edge type for the ML drug repurposing pipeline. It comes from four complementary sources, each providing a different type of evidence:</w:t>
       </w:r>
     </w:p>
     <w:tbl>
@@ -5507,7 +5587,7 @@
               <w:rPr>
                 <w:sz w:val="18"/>
               </w:rPr>
-              <w:t>Largest contributor (73%). Literature-curated, high confidence.</w:t>
+              <w:t>Literature-curated, high confidence.</w:t>
             </w:r>
           </w:p>
         </w:tc>
@@ -5522,7 +5602,7 @@
               <w:rPr>
                 <w:sz w:val="18"/>
               </w:rPr>
-              <w:t>ClinicalTrials.gov</w:t>
+              <w:t>DrugBank_Indications</w:t>
             </w:r>
           </w:p>
         </w:tc>
@@ -5535,7 +5615,7 @@
               <w:rPr>
                 <w:sz w:val="18"/>
               </w:rPr>
-              <w:t>868</w:t>
+              <w:t>2,930</w:t>
             </w:r>
           </w:p>
         </w:tc>
@@ -5548,7 +5628,7 @@
               <w:rPr>
                 <w:sz w:val="18"/>
               </w:rPr>
-              <w:t>Extracted from Phase 3/4 trial intervention-condition pairs</w:t>
+              <w:t>Text-mined from DrugBank XML indication free-text fields</w:t>
             </w:r>
           </w:p>
         </w:tc>
@@ -5561,7 +5641,7 @@
               <w:rPr>
                 <w:sz w:val="18"/>
               </w:rPr>
-              <w:t>Phase 3/4 trials are proxy evidence that a drug treats a disease (drugs have passed safety testing and shown efficacy signals).</w:t>
+              <w:t>Whole-word disease name matching against existing Disease nodes. Significantly increased coverage.</w:t>
             </w:r>
           </w:p>
         </w:tc>
@@ -5576,7 +5656,7 @@
               <w:rPr>
                 <w:sz w:val="18"/>
               </w:rPr>
-              <w:t>DrugCentral</w:t>
+              <w:t>ClinicalTrials.gov</w:t>
             </w:r>
           </w:p>
         </w:tc>
@@ -5589,7 +5669,7 @@
               <w:rPr>
                 <w:sz w:val="18"/>
               </w:rPr>
-              <w:t>157</w:t>
+              <w:t>868</w:t>
             </w:r>
           </w:p>
         </w:tc>
@@ -5602,7 +5682,7 @@
               <w:rPr>
                 <w:sz w:val="18"/>
               </w:rPr>
-              <w:t>FDA-approved indications mapped via CUI-to-DOID</w:t>
+              <w:t>Extracted from Phase 3/4 trial intervention-condition pairs</w:t>
             </w:r>
           </w:p>
         </w:tc>
@@ -5615,7 +5695,7 @@
               <w:rPr>
                 <w:sz w:val="18"/>
               </w:rPr>
-              <w:t>Regulatory evidence — these are drugs the FDA has approved for these conditions.</w:t>
+              <w:t>Phase 3/4 trials are proxy evidence that a drug treats a disease.</w:t>
             </w:r>
           </w:p>
         </w:tc>
@@ -5630,6 +5710,60 @@
               <w:rPr>
                 <w:sz w:val="18"/>
               </w:rPr>
+              <w:t>DrugCentral</w:t>
+            </w:r>
+          </w:p>
+        </w:tc>
+        <w:tc>
+          <w:tcPr>
+            <w:tcW w:type="dxa" w:w="850"/>
+          </w:tcPr>
+          <w:p>
+            <w:r>
+              <w:rPr>
+                <w:sz w:val="18"/>
+              </w:rPr>
+              <w:t>157</w:t>
+            </w:r>
+          </w:p>
+        </w:tc>
+        <w:tc>
+          <w:tcPr>
+            <w:tcW w:type="dxa" w:w="3402"/>
+          </w:tcPr>
+          <w:p>
+            <w:r>
+              <w:rPr>
+                <w:sz w:val="18"/>
+              </w:rPr>
+              <w:t>FDA-approved indications mapped via CUI-to-DOID</w:t>
+            </w:r>
+          </w:p>
+        </w:tc>
+        <w:tc>
+          <w:tcPr>
+            <w:tcW w:type="dxa" w:w="3118"/>
+          </w:tcPr>
+          <w:p>
+            <w:r>
+              <w:rPr>
+                <w:sz w:val="18"/>
+              </w:rPr>
+              <w:t>Regulatory evidence — FDA-approved indications.</w:t>
+            </w:r>
+          </w:p>
+        </w:tc>
+      </w:tr>
+      <w:tr>
+        <w:tc>
+          <w:tcPr>
+            <w:tcW w:type="dxa" w:w="1701"/>
+          </w:tcPr>
+          <w:p>
+            <w:r>
+              <w:rPr>
+                <w:sz w:val="18"/>
+              </w:rPr>
               <w:t>Total (deduplicated)</w:t>
             </w:r>
           </w:p>
@@ -5643,7 +5777,7 @@
               <w:rPr>
                 <w:sz w:val="18"/>
               </w:rPr>
-              <w:t>3,782</w:t>
+              <w:t>6,272</w:t>
             </w:r>
           </w:p>
         </w:tc>
@@ -5669,13 +5803,26 @@
               <w:rPr>
                 <w:sz w:val="18"/>
               </w:rPr>
-              <w:t>These 3,782 edges serve as positive training labels for the ML pipeline.</w:t>
+              <w:t>The original 3,782 curated edges were used as ML training labels. The 2,930 DrugBank_Indications edges were added post-training.</w:t>
             </w:r>
           </w:p>
         </w:tc>
       </w:tr>
     </w:tbl>
     <w:p/>
+    <w:p>
+      <w:pPr>
+        <w:pStyle w:val="Heading2"/>
+      </w:pPr>
+      <w:r>
+        <w:t>5.7.1 drugTreatsPhenotype — Phenotype Coverage Gap Fix</w:t>
+      </w:r>
+    </w:p>
+    <w:p>
+      <w:r>
+        <w:t>Many clinical conditions (e.g., tachycardia, edema, arrhythmia) exist only as Phenotype nodes (HPO), not Disease nodes (Disease Ontology). Since drugTreatsDisease connects Drug→Disease, these conditions had zero treatment edges. To fix this, the same DrugBank indication text-mining approach was applied against Phenotype node names, creating 10,955 drugTreatsPhenotype edges (Drug→Phenotype) from 2,646 drugs to 692 phenotypes. A blocklist filters out HPO modifier terms (Acute, Chronic, Severe, etc.) that would produce false positive matches. The NL2Cypher instructions use UNION ALL across both relationship types for treatment queries. Script: scripts/drugbank_indications.py.</w:t>
+      </w:r>
+    </w:p>
     <w:p>
       <w:pPr>
         <w:pStyle w:val="Heading2"/>
@@ -5817,7 +5964,7 @@
         <w:t xml:space="preserve">What the task is: </w:t>
       </w:r>
       <w:r>
-        <w:t>Given the CardioKB graph with 3,782 known drugTreatsDisease edges, predict which of the remaining ~4.4 million possible Drug-Disease pairs are most likely to be genuine treatment relationships. The top predictions become hypotheses for experimental validation.</w:t>
+        <w:t>Given the CardioKB graph with 3,782 known drugTreatsDisease edges (at time of training — now 6,272 after DrugBank_Indications enrichment), predict which of the remaining ~4.4 million possible Drug-Disease pairs are most likely to be genuine treatment relationships. The top predictions become hypotheses for experimental validation. Note: the ML models were trained on the original 3,782 curated edges; the 2,930 DrugBank_Indications edges were added post-training and do not affect ML results.</w:t>
       </w:r>
     </w:p>
     <w:p>
@@ -8923,7 +9070,7 @@
         <w:ind w:left="720"/>
       </w:pPr>
       <w:r>
-        <w:t>Edge count validation: Each of the 27 relationship types has expected counts</w:t>
+        <w:t>Edge count validation: Each of the 28 relationship types has expected counts</w:t>
       </w:r>
     </w:p>
     <w:p>
@@ -8932,7 +9079,7 @@
         <w:ind w:left="720"/>
       </w:pPr>
       <w:r>
-        <w:t>Source label coverage: All 19 expected edge source labels are present (plus 3 ML sources)</w:t>
+        <w:t>Source label coverage: All 20 expected edge source labels are present (plus 3 ML sources)</w:t>
       </w:r>
     </w:p>
     <w:p>
@@ -9169,12 +9316,12 @@
         <w:pStyle w:val="Heading2"/>
       </w:pPr>
       <w:r>
-        <w:t>drugTreatsDisease Enrichment (DrugBank NLP)</w:t>
-      </w:r>
-    </w:p>
-    <w:p>
-      <w:r>
-        <w:t>The current 3,782 drugTreatsDisease edges come from 3 sources (CTD, ClinicalTrials.gov, DrugCentral). DrugBank XML files contain free-text drug descriptions with treatment indications that are not captured as structured edges. NLP extraction from these descriptions could increase drugTreatsDisease edges by 2-5x, improve ML training data diversity, and add indication-level detail as edge properties.</w:t>
+        <w:t>drugTreatsDisease Enrichment (DrugBank Indications) — Implemented</w:t>
+      </w:r>
+    </w:p>
+    <w:p>
+      <w:r>
+        <w:t>The original 3,782 drugTreatsDisease edges came from 3 sources (CTD, ClinicalTrials.gov, DrugCentral). DrugBank XML files contain free-text indication fields that were not captured as structured edges. A text-mining script (scripts/drugbank_indications.py) was implemented to extract treatment relationships by matching Disease and Phenotype node names against indication text using whole-word regex matching. This added 2,930 new drugTreatsDisease edges (total: 6,272) and created a new drugTreatsPhenotype relationship type with 10,955 edges from 2,646 drugs to 692 phenotypes. The phenotype edges address conditions like tachycardia, arrhythmia, and edema that exist only as HPO Phenotype nodes. A blocklist filters out HPO modifier terms (Acute, Chronic, Severe, etc.) to prevent false positives. These edges were added post-ML-training and do not affect the ML pipeline results.</w:t>
       </w:r>
     </w:p>
     <w:p>

</xml_diff>

<commit_message>
fix: standardize data source count to 23 across all docs and UI
Queried live Memgraph to get the true count: 20 edge source labels
+ 3 node-only sources (NCBI Gene, Uberon, MeSH) = 23. Removed
MEDLINE and Jensen TISSUES (parsers exist but not in current graph
build), added DrugBank_Indications as a counted source, renumbered
tables, and regenerated the study guide.
</commit_message>
<xml_diff>
--- a/docs/CardioKB_Complete_Study_Guide.docx
+++ b/docs/CardioKB_Complete_Study_Guide.docx
@@ -86,7 +86,7 @@
         <w:spacing w:after="40"/>
       </w:pPr>
       <w:r>
-        <w:t>2. Data Sources (All 24)</w:t>
+        <w:t>2. Data Sources (All 23)</w:t>
       </w:r>
     </w:p>
     <w:p>
@@ -347,7 +347,7 @@
     </w:p>
     <w:p>
       <w:r>
-        <w:t>CardioKB is a CVD-focused biomedical knowledge graph that integrates 22 deduplicated data sources (24 total parsers, 2 additional) into a single queryable graph database. The current graph contains:</w:t>
+        <w:t>CardioKB is a CVD-focused biomedical knowledge graph that integrates 23 deduplicated data sources into a single queryable graph database. The current graph contains:</w:t>
       </w:r>
     </w:p>
     <w:p>
@@ -374,7 +374,7 @@
         <w:ind w:left="720"/>
       </w:pPr>
       <w:r>
-        <w:t>22 data sources + 3 ML prediction sources (Node2Vec, RotatE, CompGCN)</w:t>
+        <w:t>23 data sources + 3 ML prediction sources (Node2Vec, RotatE, CompGCN)</w:t>
       </w:r>
     </w:p>
     <w:p>
@@ -810,12 +810,12 @@
         <w:pStyle w:val="Heading1"/>
       </w:pPr>
       <w:r>
-        <w:t>2. Data Sources (All 24)</w:t>
-      </w:r>
-    </w:p>
-    <w:p>
-      <w:r>
-        <w:t>CardioKB integrates 24 data source parsers (22 core + 2 additional), each contributing unique node types and/or relationship types. Sources were selected based on three criteria: (1) authoritative coverage of a specific biological entity type, (2) no redundancy with other included sources, and (3) public accessibility. During a systematic deduplication audit, 12 sources were removed (DisGeNET, GWAS Catalog, Jensen DISEASES, OMIM, WikiPathways, AOP-DB, HGNC base, CellAge, GenAge, Hetionet precomputed, DrugAge, AnAge).</w:t>
+        <w:t>2. Data Sources (All 23)</w:t>
+      </w:r>
+    </w:p>
+    <w:p>
+      <w:r>
+        <w:t>CardioKB integrates 23 data sources, each contributing unique node types and/or relationship types. Sources were selected based on three criteria: (1) authoritative coverage of a specific biological entity type, (2) no redundancy with other included sources, and (3) public accessibility. During a systematic deduplication audit, 12 sources were removed (DisGeNET, GWAS Catalog, Jensen DISEASES, OMIM, WikiPathways, AOP-DB, HGNC base, CellAge, GenAge, Hetionet precomputed, DrugAge, AnAge).</w:t>
       </w:r>
     </w:p>
     <w:p>
@@ -901,7 +901,7 @@
         <w:pStyle w:val="Heading2"/>
       </w:pPr>
       <w:r>
-        <w:t>Hetionet-Derived Component Parsers (17 sources)</w:t>
+        <w:t>Hetionet-Derived Component Parsers (15 sources)</w:t>
       </w:r>
     </w:p>
     <w:p>
@@ -973,7 +973,7 @@
     </w:p>
     <w:p>
       <w:r>
-        <w:t>Why included: Provides anatomy identifiers that Bgee and Jensen TISSUES use to link gene expression to anatomical locations.</w:t>
+        <w:t>Why included: Provides anatomy identifiers that Bgee uses to link gene expression to anatomical locations.</w:t>
       </w:r>
     </w:p>
     <w:p>
@@ -1058,23 +1058,23 @@
         <w:rPr>
           <w:b/>
         </w:rPr>
-        <w:t>12. MEDLINE</w:t>
+        <w:t>12. DrugCentral</w:t>
       </w:r>
       <w:r/>
     </w:p>
     <w:p>
       <w:r>
-        <w:t>Contribution: 365 cooccurrence edges (244 anatomy + 117 symptom + 4 disease)</w:t>
-      </w:r>
-    </w:p>
-    <w:p>
-      <w:r>
-        <w:t>Why included: Literature cooccurrence from MEDLINE abstracts.</w:t>
-      </w:r>
-    </w:p>
-    <w:p>
-      <w:r>
-        <w:t>Limitation: Very small dataset from pinned GitHub commit. Legacy source.</w:t>
+        <w:t>Contribution: 16,403 pharmacologic class + 245 treats + 96 palliates edges</w:t>
+      </w:r>
+    </w:p>
+    <w:p>
+      <w:r>
+        <w:t>Why included: Only source for pharmacologic class assignments and FDA-approved indications. CUI-to-DOID mapped.</w:t>
+      </w:r>
+    </w:p>
+    <w:p>
+      <w:r>
+        <w:t>Limitation: Not all DrugCentral entries have DrugBank cross-references.</w:t>
       </w:r>
     </w:p>
     <w:p>
@@ -1082,23 +1082,23 @@
         <w:rPr>
           <w:b/>
         </w:rPr>
-        <w:t>13. DrugCentral</w:t>
+        <w:t>13. BindingDB</w:t>
       </w:r>
       <w:r/>
     </w:p>
     <w:p>
       <w:r>
-        <w:t>Contribution: 16,403 pharmacologic class + 245 treats + 96 palliates edges</w:t>
-      </w:r>
-    </w:p>
-    <w:p>
-      <w:r>
-        <w:t>Why included: Only source for pharmacologic class assignments and FDA-approved indications. CUI-to-DOID mapped.</w:t>
-      </w:r>
-    </w:p>
-    <w:p>
-      <w:r>
-        <w:t>Limitation: Not all DrugCentral entries have DrugBank cross-references.</w:t>
+        <w:t>Contribution: 12,250 chemicalBindsGene edges</w:t>
+      </w:r>
+    </w:p>
+    <w:p>
+      <w:r>
+        <w:t>Why included: Complements DrugBank with experimentally measured binding affinities from a different curation source.</w:t>
+      </w:r>
+    </w:p>
+    <w:p>
+      <w:r>
+        <w:t>Limitation: No binding affinity values loaded as properties (only edge existence).</w:t>
       </w:r>
     </w:p>
     <w:p>
@@ -1106,23 +1106,23 @@
         <w:rPr>
           <w:b/>
         </w:rPr>
-        <w:t>14. BindingDB</w:t>
+        <w:t>14. PubTator Central</w:t>
       </w:r>
       <w:r/>
     </w:p>
     <w:p>
       <w:r>
-        <w:t>Contribution: 12,250 chemicalBindsGene edges</w:t>
-      </w:r>
-    </w:p>
-    <w:p>
-      <w:r>
-        <w:t>Why included: Complements DrugBank with experimentally measured binding affinities from a different curation source.</w:t>
-      </w:r>
-    </w:p>
-    <w:p>
-      <w:r>
-        <w:t>Limitation: No binding affinity values loaded as properties (only edge existence).</w:t>
+        <w:t>Contribution: 744,427 geneAssociatesWithDisease + 4,320 diseaseAssociatesWithDisease edges (CVD AND-filter)</w:t>
+      </w:r>
+    </w:p>
+    <w:p>
+      <w:r>
+        <w:t>Why included: Largest source of literature-mined gene-disease associations.</w:t>
+      </w:r>
+    </w:p>
+    <w:p>
+      <w:r>
+        <w:t>Limitation: Cooccurrence is not causation. MeSH-to-DOID mapping introduces potential mismatches.</w:t>
       </w:r>
     </w:p>
     <w:p>
@@ -1130,23 +1130,23 @@
         <w:rPr>
           <w:b/>
         </w:rPr>
-        <w:t>15. PubTator Central</w:t>
+        <w:t>15. CTD</w:t>
       </w:r>
       <w:r/>
     </w:p>
     <w:p>
       <w:r>
-        <w:t>Contribution: 744,427 geneAssociatesWithDisease + 4,320 diseaseAssociatesWithDisease edges (CVD AND-filter)</w:t>
-      </w:r>
-    </w:p>
-    <w:p>
-      <w:r>
-        <w:t>Why included: Largest source of literature-mined gene-disease associations.</w:t>
-      </w:r>
-    </w:p>
-    <w:p>
-      <w:r>
-        <w:t>Limitation: Cooccurrence is not causation. MeSH-to-DOID mapping introduces potential mismatches.</w:t>
+        <w:t>Contribution: 4,572 unique Drug nodes; 116,451 chemIncreasesExp + 97,951 chemDecreasesExp edges; 2,757 drugTreatsDisease edges</w:t>
+      </w:r>
+    </w:p>
+    <w:p>
+      <w:r>
+        <w:t>Why included: Only source for directional chemical-gene expression effects (increases vs. decreases). Also contributes 73% of drugTreatsDisease edges.</w:t>
+      </w:r>
+    </w:p>
+    <w:p>
+      <w:r>
+        <w:t>Limitation: Expression relationships curated from literature; may not reflect dose/tissue-specific effects.</w:t>
       </w:r>
     </w:p>
     <w:p>
@@ -1154,23 +1154,23 @@
         <w:rPr>
           <w:b/>
         </w:rPr>
-        <w:t>16. CTD</w:t>
+        <w:t>16. Bgee (Gene Expression Atlas)</w:t>
       </w:r>
       <w:r/>
     </w:p>
     <w:p>
       <w:r>
-        <w:t>Contribution: 4,572 unique Drug nodes; 116,451 chemIncreasesExp + 97,951 chemDecreasesExp edges; 2,757 drugTreatsDisease edges</w:t>
-      </w:r>
-    </w:p>
-    <w:p>
-      <w:r>
-        <w:t>Why included: Only source for directional chemical-gene expression effects (increases vs. decreases). Also contributes 73% of drugTreatsDisease edges.</w:t>
-      </w:r>
-    </w:p>
-    <w:p>
-      <w:r>
-        <w:t>Limitation: Expression relationships curated from literature; may not reflect dose/tissue-specific effects.</w:t>
+        <w:t>Contribution: 784,026 underexpresses + 1,872 overexpresses edges with expressionScore</w:t>
+      </w:r>
+    </w:p>
+    <w:p>
+      <w:r>
+        <w:t>Why included: Only source for tissue-specific gene expression patterns with quantitative scores.</w:t>
+      </w:r>
+    </w:p>
+    <w:p>
+      <w:r>
+        <w:t>Limitation: Heavily skewed toward underexpression (784K vs 1.9K).</w:t>
       </w:r>
     </w:p>
     <w:p>
@@ -1178,23 +1178,23 @@
         <w:rPr>
           <w:b/>
         </w:rPr>
-        <w:t>17. Bgee (Gene Expression Atlas)</w:t>
+        <w:t>17. HPO</w:t>
       </w:r>
       <w:r/>
     </w:p>
     <w:p>
       <w:r>
-        <w:t>Contribution: 784,026 underexpresses + 1,872 overexpresses edges with expressionScore</w:t>
-      </w:r>
-    </w:p>
-    <w:p>
-      <w:r>
-        <w:t>Why included: Only source for tissue-specific gene expression patterns with quantitative scores.</w:t>
-      </w:r>
-    </w:p>
-    <w:p>
-      <w:r>
-        <w:t>Limitation: Heavily skewed toward underexpression (784K vs 1.9K).</w:t>
+        <w:t>Contribution: 19,389 Phenotype nodes; 162,994 geneAssociatesWithPhenotype edges</w:t>
+      </w:r>
+    </w:p>
+    <w:p>
+      <w:r>
+        <w:t>Why included: Only source for gene-phenotype associations. Connects genetics to observable clinical features.</w:t>
+      </w:r>
+    </w:p>
+    <w:p>
+      <w:r>
+        <w:t>Limitation: Annotations primarily from rare/Mendelian diseases; may underrepresent complex CVD phenotypes.</w:t>
       </w:r>
     </w:p>
     <w:p>
@@ -1202,23 +1202,23 @@
         <w:rPr>
           <w:b/>
         </w:rPr>
-        <w:t>18. Jensen TISSUES</w:t>
+        <w:t>18. Reactome</w:t>
       </w:r>
       <w:r/>
     </w:p>
     <w:p>
       <w:r>
-        <w:t>Contribution: 215,235 gene-tissue edges</w:t>
-      </w:r>
-    </w:p>
-    <w:p>
-      <w:r>
-        <w:t>Why included: Gene-tissue expression associations.</w:t>
-      </w:r>
-    </w:p>
-    <w:p>
-      <w:r>
-        <w:t>Limitation: Uses BTO tissue ontology; mapping to Uberon required BTO-to-Uberon resolution.</w:t>
+        <w:t>Contribution: 44,979 geneInPathway + 44,979 pathwayContainsGene edges</w:t>
+      </w:r>
+    </w:p>
+    <w:p>
+      <w:r>
+        <w:t>Why included: Authoritative curated biological pathway assignments.</w:t>
+      </w:r>
+    </w:p>
+    <w:p>
+      <w:r>
+        <w:t>Limitation: Pathway boundaries are somewhat arbitrary; genes appear in many overlapping pathways.</w:t>
       </w:r>
     </w:p>
     <w:p>
@@ -1226,23 +1226,23 @@
         <w:rPr>
           <w:b/>
         </w:rPr>
-        <w:t>19. HPO</w:t>
+        <w:t>19. STRING</w:t>
       </w:r>
       <w:r/>
     </w:p>
     <w:p>
       <w:r>
-        <w:t>Contribution: 19,389 Phenotype nodes; 162,994 geneAssociatesWithPhenotype edges</w:t>
-      </w:r>
-    </w:p>
-    <w:p>
-      <w:r>
-        <w:t>Why included: Only source for gene-phenotype associations. Connects genetics to observable clinical features.</w:t>
-      </w:r>
-    </w:p>
-    <w:p>
-      <w:r>
-        <w:t>Limitation: Annotations primarily from rare/Mendelian diseases; may underrepresent complex CVD phenotypes.</w:t>
+        <w:t>Contribution: 121,170 geneInteractsWithGene edges (confidence &gt; 700, with combinedScore)</w:t>
+      </w:r>
+    </w:p>
+    <w:p>
+      <w:r>
+        <w:t>Why included: Largest source for protein-protein interaction data. Confidence &gt; 700 filter ensures high quality.</w:t>
+      </w:r>
+    </w:p>
+    <w:p>
+      <w:r>
+        <w:t>Limitation: Combined scores integrate heterogeneous evidence; not all are physical binding.</w:t>
       </w:r>
     </w:p>
     <w:p>
@@ -1250,23 +1250,31 @@
         <w:rPr>
           <w:b/>
         </w:rPr>
-        <w:t>20. Reactome</w:t>
+        <w:t>20. OpenTargets</w:t>
       </w:r>
       <w:r/>
     </w:p>
     <w:p>
       <w:r>
-        <w:t>Contribution: 44,979 geneInPathway + 44,979 pathwayContainsGene edges</w:t>
-      </w:r>
-    </w:p>
-    <w:p>
-      <w:r>
-        <w:t>Why included: Authoritative curated biological pathway assignments.</w:t>
-      </w:r>
-    </w:p>
-    <w:p>
-      <w:r>
-        <w:t>Limitation: Pathway boundaries are somewhat arbitrary; genes appear in many overlapping pathways.</w:t>
+        <w:t>Contribution: 32,826 geneAssociatesWithDisease edges (CVD AND-filter, EFO-to-DOID mapped)</w:t>
+      </w:r>
+    </w:p>
+    <w:p>
+      <w:r>
+        <w:t>Why included: Curated gene-disease associations from genetic, somatic, literature, and drug evidence.</w:t>
+      </w:r>
+    </w:p>
+    <w:p>
+      <w:r>
+        <w:t>Limitation: Uses EFO ontology requiring EFO-to-DOID mapping. Some EFO terms lack DOID equivalents.</w:t>
+      </w:r>
+    </w:p>
+    <w:p>
+      <w:pPr>
+        <w:pStyle w:val="Heading2"/>
+      </w:pPr>
+      <w:r>
+        <w:t>Additional Sources (3)</w:t>
       </w:r>
     </w:p>
     <w:p>
@@ -1274,23 +1282,13 @@
         <w:rPr>
           <w:b/>
         </w:rPr>
-        <w:t>21. STRING</w:t>
+        <w:t>21. HGNC Gene Families</w:t>
       </w:r>
       <w:r/>
     </w:p>
     <w:p>
       <w:r>
-        <w:t>Contribution: 121,170 geneInteractsWithGene edges (confidence &gt; 700, with combinedScore)</w:t>
-      </w:r>
-    </w:p>
-    <w:p>
-      <w:r>
-        <w:t>Why included: Largest source for protein-protein interaction data. Confidence &gt; 700 filter ensures high quality.</w:t>
-      </w:r>
-    </w:p>
-    <w:p>
-      <w:r>
-        <w:t>Limitation: Combined scores integrate heterogeneous evidence; not all are physical binding.</w:t>
+        <w:t>Contribution: 1,934 GeneFamily nodes, 5,123 geneInFamily + 5,123 familyContainsGene edges. Why included: Only source for gene family membership. Useful for identifying related genes sharing drug targets or disease associations. Limitation: Not all genes belong to defined families.</w:t>
       </w:r>
     </w:p>
     <w:p>
@@ -1298,23 +1296,27 @@
         <w:rPr>
           <w:b/>
         </w:rPr>
-        <w:t>22. OpenTargets</w:t>
+        <w:t>22. ClinVar</w:t>
       </w:r>
       <w:r/>
     </w:p>
     <w:p>
       <w:r>
-        <w:t>Contribution: 32,826 geneAssociatesWithDisease edges (CVD AND-filter, EFO-to-DOID mapped)</w:t>
-      </w:r>
-    </w:p>
-    <w:p>
-      <w:r>
-        <w:t>Why included: Curated gene-disease associations from genetic, somatic, literature, and drug evidence.</w:t>
-      </w:r>
-    </w:p>
-    <w:p>
-      <w:r>
-        <w:t>Limitation: Uses EFO ontology requiring EFO-to-DOID mapping. Some EFO terms lack DOID equivalents.</w:t>
+        <w:t>Contribution: 4,488,042 Variant nodes, 2,267,095 hasVariant + 2,267,095 variantInGene edges with clinicalSignificance property. Why included: Authoritative source for clinical variant interpretations. Provides the Variant node backbone and variant-gene-disease linkages. Limitation: Largest single source (4.5M nodes). Only 0.12% of ClinVar variant-disease associations map to CardioKB Disease nodes because UMLS CUI overlap between ClinVar and Disease Ontology is only 212 CUIs. This is expected and documented.</w:t>
+      </w:r>
+    </w:p>
+    <w:p>
+      <w:r>
+        <w:rPr>
+          <w:b/>
+        </w:rPr>
+        <w:t>23. DrugBank_Indications (text-mined)</w:t>
+      </w:r>
+      <w:r/>
+    </w:p>
+    <w:p>
+      <w:r>
+        <w:t>Contribution: 2,930 drugTreatsDisease edges + 10,955 drugTreatsPhenotype edges. Why included: Text-mined from DrugBank XML indication free-text fields via scripts/drugbank_indications.py. Significantly increased treatment edge coverage by matching indication text against Disease and Phenotype node names. Counted as a separate source because edges carry the distinct source label "DrugBank_Indications" in the graph. Limitation: Text-mining approach uses whole-word matching, which may miss complex indication descriptions.</w:t>
       </w:r>
     </w:p>
     <w:p>
@@ -1322,35 +1324,25 @@
         <w:pStyle w:val="Heading2"/>
       </w:pPr>
       <w:r>
-        <w:t>Additional Parsers (2 sources)</w:t>
-      </w:r>
-    </w:p>
-    <w:p>
-      <w:r>
-        <w:rPr>
-          <w:b/>
-        </w:rPr>
-        <w:t>23. HGNC Gene Families</w:t>
-      </w:r>
-      <w:r/>
-    </w:p>
-    <w:p>
-      <w:r>
-        <w:t>Contribution: 1,934 GeneFamily nodes, 5,123 geneInFamily + 5,123 familyContainsGene edges. Why included: Only source for gene family membership. Useful for identifying related genes sharing drug targets or disease associations. Limitation: Not all genes belong to defined families.</w:t>
-      </w:r>
-    </w:p>
-    <w:p>
-      <w:r>
-        <w:rPr>
-          <w:b/>
-        </w:rPr>
-        <w:t>24. ClinVar</w:t>
-      </w:r>
-      <w:r/>
-    </w:p>
-    <w:p>
-      <w:r>
-        <w:t>Contribution: 4,488,042 Variant nodes, 2,267,095 hasVariant + 2,267,095 variantInGene edges with clinicalSignificance property. Why included: Authoritative source for clinical variant interpretations. Provides the Variant node backbone and variant-gene-disease linkages. Limitation: Largest single source (4.5M nodes). Only 0.12% of ClinVar variant-disease associations map to CardioKB Disease nodes because UMLS CUI overlap between ClinVar and Disease Ontology is only 212 CUIs. This is expected and documented.</w:t>
+        <w:t>How Sources Interconnect</w:t>
+      </w:r>
+    </w:p>
+    <w:p>
+      <w:r>
+        <w:t>The 23 sources form an interconnected web through shared node types. The Gene node (from NCBI Gene) is the central hub: STRING connects genes to genes, DrugBank/BindingDB connects drugs to genes, PubTator/OpenTargets connects genes to diseases, HPO connects genes to phenotypes, Reactome connects genes to pathways, CTD/LINCS L1000 connects drugs to genes via expression, and ClinVar connects variants to genes. The Drug node (from DrugBank/CTD) is the second hub: ClinicalTrials connects drugs to trials and diseases, DrugCentral provides pharmacologic classes and treatment edges, SIDER provides side effects. The Disease node (from Disease Ontology) connects everything through disease associations. This hub structure means a single query can traverse from any entity type to any other.</w:t>
+      </w:r>
+    </w:p>
+    <w:p>
+      <w:r>
+        <w:br w:type="page"/>
+      </w:r>
+    </w:p>
+    <w:p>
+      <w:pPr>
+        <w:pStyle w:val="Heading1"/>
+      </w:pPr>
+      <w:r>
+        <w:t>3. Graph Structure</w:t>
       </w:r>
     </w:p>
     <w:p>
@@ -1358,38 +1350,12 @@
         <w:pStyle w:val="Heading2"/>
       </w:pPr>
       <w:r>
-        <w:t>How Sources Interconnect</w:t>
-      </w:r>
-    </w:p>
-    <w:p>
-      <w:r>
-        <w:t>The 24 sources form an interconnected web through shared node types. The Gene node (from NCBI Gene) is the central hub: STRING connects genes to genes, DrugBank/BindingDB connects drugs to genes, PubTator/OpenTargets connects genes to diseases, HPO connects genes to phenotypes, Reactome connects genes to pathways, CTD/LINCS L1000 connects drugs to genes via expression, and ClinVar connects variants to genes. The Drug node (from DrugBank/CTD) is the second hub: ClinicalTrials connects drugs to trials and diseases, DrugCentral provides pharmacologic classes and treatment edges, SIDER provides side effects. The Disease node (from Disease Ontology) connects everything through disease associations. This hub structure means a single query can traverse from any entity type to any other.</w:t>
-      </w:r>
-    </w:p>
-    <w:p>
-      <w:r>
-        <w:br w:type="page"/>
-      </w:r>
-    </w:p>
-    <w:p>
-      <w:pPr>
-        <w:pStyle w:val="Heading1"/>
-      </w:pPr>
-      <w:r>
-        <w:t>3. Graph Structure</w:t>
-      </w:r>
-    </w:p>
-    <w:p>
-      <w:pPr>
-        <w:pStyle w:val="Heading2"/>
-      </w:pPr>
-      <w:r>
         <w:t>Scale</w:t>
       </w:r>
     </w:p>
     <w:p>
       <w:r>
-        <w:t>The current CardioKB graph (as of July 2026) contains 459,092 nodes across 17 distinct node types and 5,456,579 relationships across 28 relationship types. There are 22 data sources providing edges (each tagged with a source property), plus 3 ML prediction sources and 1 text-mined source (DrugBank_Indications). Every single relationship in the graph carries a source property identifying which database or model produced it.</w:t>
+        <w:t>The current CardioKB graph (as of July 2026) contains 459,092 nodes across 17 distinct node types and 5,456,579 relationships across 28 relationship types. There are 23 data sources (each tagged with a source property), plus 3 ML prediction sources. Every single relationship in the graph carries a source property identifying which database or model produced it.</w:t>
       </w:r>
     </w:p>
     <w:p>
@@ -5125,7 +5091,7 @@
     </w:p>
     <w:p>
       <w:r>
-        <w:t>Before BaseAgent, building a knowledge graph of this scale required months of manual work: writing individual parsers, debugging ID mismatches, validating output, and loading data. With BaseAgent, the entire CardioKB graph (459K nodes, 5.4M edges, 24 sources) can be rebuilt from scratch in approximately 5 minutes. This makes the graph reproducible and updatable: when a source database releases new data, re-running the pipeline incorporates the updates automatically.</w:t>
+        <w:t>Before BaseAgent, building a knowledge graph of this scale required months of manual work: writing individual parsers, debugging ID mismatches, validating output, and loading data. With BaseAgent, the entire CardioKB graph (459K nodes, 5.4M edges, 23 sources) can be rebuilt from scratch in approximately 5 minutes. This makes the graph reproducible and updatable: when a source database releases new data, re-running the pipeline incorporates the updates automatically.</w:t>
       </w:r>
     </w:p>
     <w:p>

</xml_diff>